<commit_message>
fix: clarify CMS RCA guidance as technique reference only (PSQ7)
5.3/5.4 cited CMS RCA guidance (US) twice with no indication it was one
technique among several. Added a note that the RCA requirement itself
comes from NABH PSQ.7, satisfiable by any structured RCA method.

Co-Authored-By: Claude Sonnet 5 <noreply@anthropic.com>
Claude-Session: https://claude.ai/code/session_01TPRLtLhmTCP5z94Q3FiE5v
</commit_message>
<xml_diff>
--- a/policies/build/chapters_v2/PSQ/document/PSQ_Package_v2/PSQ7/SOP_PSQ7_incident_management_and_safety_events.docx
+++ b/policies/build/chapters_v2/PSQ/document/PSQ_Package_v2/PSQ7/SOP_PSQ7_incident_management_and_safety_events.docx
@@ -321,42 +321,27 @@
     </w:p>
     <w:p>
       <w:r>
-        <w:t xml:space="preserve">Quality Coordinator: </w:t>
-      </w:r>
-      <w:r>
-        <w:t>leads day-to-day work on this policy and owns the required records.</w:t>
+        <w:t xml:space="preserve">Quality Coordinator: leads day-to-day work on this policy and owns the required records.</w:t>
       </w:r>
     </w:p>
     <w:p>
       <w:r>
-        <w:t xml:space="preserve">Safety/Quality Committee: </w:t>
-      </w:r>
-      <w:r>
-        <w:t>reviews progress on this policy at least monthly and signs off the annual review.</w:t>
+        <w:t xml:space="preserve">Safety/Quality Committee: reviews progress on this policy at least monthly and signs off the annual review.</w:t>
       </w:r>
     </w:p>
     <w:p>
       <w:r>
-        <w:t xml:space="preserve">Department Heads: </w:t>
-      </w:r>
-      <w:r>
-        <w:t>carry out the parts of this policy that apply within their own department.</w:t>
+        <w:t xml:space="preserve">Department Heads: carry out the parts of this policy that apply within their own department.</w:t>
       </w:r>
     </w:p>
     <w:p>
       <w:r>
-        <w:t xml:space="preserve">Medical Superintendent / Governing Body: </w:t>
-      </w:r>
-      <w:r>
-        <w:t>provides resources and reviews outcomes reported to them.</w:t>
+        <w:t xml:space="preserve">Medical Superintendent / Governing Body: provides resources and reviews outcomes reported to them.</w:t>
       </w:r>
     </w:p>
     <w:p>
       <w:r>
-        <w:t xml:space="preserve">All staff in scope: </w:t>
-      </w:r>
-      <w:r>
-        <w:t>follow the steps below and raise any Stop-Work concern immediately, without waiting for permission.</w:t>
+        <w:t xml:space="preserve">All staff in scope: follow the steps below and raise any Stop-Work concern immediately, without waiting for permission.</w:t>
       </w:r>
     </w:p>
     <w:p>
@@ -655,6 +640,14 @@
     </w:p>
     <w:p>
       <w:pPr>
+        <w:pStyle w:val="ListParagraph"/>
+      </w:pPr>
+      <w:r>
+        <w:t>Note: this CMS guidance is cited for RCA technique only. NABH does not mandate this specific methodology or body — the requirement to conduct and document a root-cause analysis comes from NABH’s own PSQ.7 standard, which any structured RCA technique can satisfy.</w:t>
+      </w:r>
+    </w:p>
+    <w:p>
+      <w:pPr>
         <w:pStyle w:val="Heading2"/>
       </w:pPr>
       <w:r>
@@ -719,6 +712,14 @@
           <w:t>Centers for Medicare &amp; Medicaid Services. (n.d.). Guidance for performing root cause analysis (RCA) with performance improvement projects (PIPs).</w:t>
         </w:r>
       </w:hyperlink>
+    </w:p>
+    <w:p>
+      <w:pPr>
+        <w:pStyle w:val="ListParagraph"/>
+      </w:pPr>
+      <w:r>
+        <w:t>Note: this CMS guidance is cited for RCA technique only. NABH does not mandate this specific methodology or body — the requirement to conduct and document a root-cause analysis comes from NABH’s own PSQ.7 standard, which any structured RCA technique can satisfy.</w:t>
+      </w:r>
     </w:p>
     <w:p>
       <w:pPr>

</xml_diff>